<commit_message>
T3 conditional fix + typo fix + working drafts
- "organisms that live there" → "any organisms that may live there" (2 files)
- "Whatever sustains itself" → "Whatever may sustain itself" (2 files)
- "half way in to" → "half way into" (summary.tex)
- Plans 0285a/b, 0297; memoir v3; pictogram gallery; mastodon draft

Co-Authored-By: Claude Opus 4.6 <noreply@anthropic.com>
</commit_message>
<xml_diff>
--- a/memoir/drafts/bruce-half-v3.docx
+++ b/memoir/drafts/bruce-half-v3.docx
@@ -12,14 +12,6 @@
     </w:p>
     <w:p>
       <w:pPr>
-        <w:pStyle w:val="Author"/>
-      </w:pPr>
-      <w:r>
-        <w:t xml:space="preserve">Bruce Stephenson and Lawrence Mysak</w:t>
-      </w:r>
-    </w:p>
-    <w:p>
-      <w:pPr>
         <w:pStyle w:val="FirstParagraph"/>
       </w:pPr>
       <w:r>
@@ -46,7 +38,7 @@
         <w:pStyle w:val="FirstParagraph"/>
       </w:pPr>
       <w:r>
-        <w:t xml:space="preserve">In January 2024, Bruce Stephenson and his mother Linda joined a Road Scholar tour through Costa Rica. He expected retirees on a bus. The bus turned out to be full of doctors, a brain surgeon or two, and a flute-playing professor emeritus from McGill with a hundred and eighty published papers to his credit. He is the other author of this story.</w:t>
+        <w:t xml:space="preserve">In January 2024, Bruce Stephenson and his mother Linda joined a Road Scholar tour through Costa Rica. Bruce expected retirees on a bus. The bus turned out to be full of doctors, a brain surgeon or two, and a flute-playing professor emeritus from McGill with a hundred and eighty published papers to his credit. He is the other author of this story.</w:t>
       </w:r>
     </w:p>
     <w:p>
@@ -127,7 +119,7 @@
         <w:pStyle w:val="BodyText"/>
       </w:pPr>
       <w:r>
-        <w:t xml:space="preserve">Bruce read them that week. They were master-class work — insightful, expertly structured, a pleasure the way a well-made thing is always a pleasure. Then he read ten more, and the abstracts of all hundred and eighty, time-sequenced. One evening, Bruce and Linda sat down with Lawrence and edited one of the memoir chapters he had been writing for years — the story of Bob Dietz and a conference behind the Iron Curtain. They saw what goes into a memoir before they knew they’d be writing one.</w:t>
+        <w:t xml:space="preserve">Bruce read them that week. They were master-class work, a pleasure the way a well-made thing is always a pleasure. Then he read ten more, and the abstracts of all hundred and eighty, time-sequenced. One evening, Bruce and Linda sat down with Lawrence and edited one of the memoir chapters he had been writing for years — the story of Bob Dietz and a conference behind the Iron Curtain. They saw what goes into a memoir before they knew they’d be writing one.</w:t>
       </w:r>
     </w:p>
     <w:p>
@@ -174,15 +166,15 @@
         <w:pStyle w:val="BodyText"/>
       </w:pPr>
       <w:r>
-        <w:t xml:space="preserve">For nearly two years there was no sustained contact between them. During that time, a friend Bruce had mentored in math years earlier, Robin Macomber, returned with mathematics he’d derived — tipping points, criticality, the dynamics of systems near sudden transitions. Evaluating Robin’s work, Bruce recognized patterns from his own cross-domain reading and searched further. The same mathematical structure appeared independently across field after field, often without cross-citation. This became a paper — THE paper — posted to arXiv in January 2026 (2601.22389).</w:t>
-      </w:r>
-    </w:p>
-    <w:p>
-      <w:pPr>
-        <w:pStyle w:val="BodyText"/>
-      </w:pPr>
-      <w:r>
-        <w:t xml:space="preserve">In February, Bruce reconnected with Lawrence and told him he had been the inspiration. Then he discovered something he’d missed entirely in 2024: the mathematics he’d been tracing across domains led directly back to Lawrence’s own thermohaline circulation work. The encouragement had created the path that returned to the encourager.</w:t>
+        <w:t xml:space="preserve">For nearly two years there was no sustained contact between them. During that time, a friend Bruce had mentored in math years earlier, Robin Macomber, returned with mathematics he’d derived — tipping points, criticality, the dynamics of systems near sudden transitions. Evaluating Robin’s work, Bruce recognized patterns from his own cross-domain reading and searched further. The same mathematical structure appeared independently across field after field, often without cross-citation. This became a paper — Bruce’s first real math paper — posted to arXiv in January 2026 (2601.22389).</w:t>
+      </w:r>
+    </w:p>
+    <w:p>
+      <w:pPr>
+        <w:pStyle w:val="BodyText"/>
+      </w:pPr>
+      <w:r>
+        <w:t xml:space="preserve">In February, Bruce reconnected with Lawrence and told him: you inspired this. Then he discovered something he’d missed entirely: the mathematics he’d been tracing across domains led directly back to Lawrence’s own thermohaline circulation work. The encouragement had created the path that returned to the encourager.</w:t>
       </w:r>
     </w:p>
     <w:p>
@@ -224,13 +216,11 @@
         <w:t xml:space="preserve"> </w:t>
       </w:r>
       <w:r>
-        <w:t xml:space="preserve">“</w:t>
-      </w:r>
-      <w:r>
+        <w:rPr>
+          <w:iCs/>
+          <w:i/>
+        </w:rPr>
         <w:t xml:space="preserve">go to graduate school</w:t>
-      </w:r>
-      <w:r>
-        <w:t xml:space="preserve">”</w:t>
       </w:r>
       <w:r>
         <w:t xml:space="preserve"> </w:t>

</xml_diff>